<commit_message>
Alinea la documentación con el estado al 22-10-2026 (S11)
- Base de datos en Supabase reflejada en docs 08, 10, 11, DAS (v3.1), Acta (v2.1) y DIAG-13
- Cifras unificadas: 63 RF, 11 RNF, 41 CU, 35 diagramas, 24 paquetes EDT, 22/22 pruebas
- Semana actual S11 en planes, ERS (rev. 04.1) y Carta Gantt (DIAG-31)
- Control de cambios ordenado; nuevas SC-19 (despliegue) y SC-20 (alojamiento de la API)
- Riesgos: R-02 y R-08 actualizados; nuevo R-14 (tablas del prototipo con acceso público)
- Informe de avance y EDT con el estado real; sección 8 del inventario y README
</commit_message>
<xml_diff>
--- a/Fase 2/Evidencias Proyecto/Evidencias de documentación/00_Inventario_y_Resumen_de_Cambios.docx
+++ b/Fase 2/Evidencias Proyecto/Evidencias de documentación/00_Inventario_y_Resumen_de_Cambios.docx
@@ -434,7 +434,7 @@
                 <w:sz w:val="20"/>
                 <w:szCs w:val="20"/>
               </w:rPr>
-              <w:t>9 de octubre de 2026</w:t>
+              <w:t>22 de octubre de 2026 (actualización de coherencia; S11)</w:t>
             </w:r>
           </w:p>
         </w:tc>
@@ -497,7 +497,7 @@
                 <w:sz w:val="20"/>
                 <w:szCs w:val="20"/>
               </w:rPr>
-              <w:t>1.0</w:t>
+              <w:t>2.0</w:t>
             </w:r>
           </w:p>
         </w:tc>
@@ -532,7 +532,7 @@
           <w:sz w:val="22"/>
           <w:szCs w:val="22"/>
         </w:rPr>
-        <w:t>Este documento resume la actualización integral de la documentación del Proyecto Barbería Big-Boys realizada el 9 de octubre de 2026, con el código en pausa (stand by). Incluye el inventario inicial, los cambios por documento, los nuevos entregables, los diagramas y los supuestos que deben validarse.</w:t>
+        <w:t>Este documento resume la actualización integral de la documentación del Proyecto Barbería Big-Boys realizada el 9 de octubre de 2026, con el código en pausa (stand by), y la actualización de coherencia del 22 de octubre de 2026 (sección 8). Incluye el inventario inicial, los cambios por documento, los nuevos entregables, los diagramas y los supuestos que deben validarse.</w:t>
       </w:r>
     </w:p>
     <w:p>
@@ -1121,7 +1121,7 @@
                 <w:sz w:val="14"/>
                 <w:szCs w:val="14"/>
               </w:rPr>
-              <w:t>Rev. 04: 61 RF / 11 RNF; módulos J (privacidad), K (sucursal) y L (gobierno); BD relacional; fechas corregidas</w:t>
+              <w:t>Rev. 04: 63 RF (58 de la V1 y 5 del roadmap V2) / 11 RNF; módulos J (privacidad), K (sucursal) y L (gobierno); BD relacional; fechas corregidas</w:t>
             </w:r>
           </w:p>
         </w:tc>
@@ -1255,7 +1255,7 @@
                 <w:sz w:val="14"/>
                 <w:szCs w:val="14"/>
               </w:rPr>
-              <w:t>v3.0: 4+1 completo con 34 diagramas, BD relacional, despliegue actual y futuro</w:t>
+              <w:t>v3.0 (actualizado a v3.1 el 22-10-2026): 4+1 completo con 35 diagramas, BD relacional, despliegue actual y futuro</w:t>
             </w:r>
           </w:p>
         </w:tc>
@@ -1785,7 +1785,7 @@
                 <w:sz w:val="14"/>
                 <w:szCs w:val="14"/>
               </w:rPr>
-              <w:t>61 RF / 11 RNF con criterios y trazabilidad a objetivos y CU</w:t>
+              <w:t>63 RF / 11 RNF con criterios y trazabilidad a objetivos y CU</w:t>
             </w:r>
           </w:p>
         </w:tc>
@@ -2050,7 +2050,7 @@
                 <w:sz w:val="14"/>
                 <w:szCs w:val="14"/>
               </w:rPr>
-              <w:t>26 paquetes, diagrama WBS y diccionario</w:t>
+              <w:t>24 paquetes, diagrama WBS y diccionario</w:t>
             </w:r>
           </w:p>
         </w:tc>
@@ -2711,7 +2711,7 @@
                 <w:sz w:val="14"/>
                 <w:szCs w:val="14"/>
               </w:rPr>
-              <w:t>Proceso, CCB y registro SC-01 a SC-10</w:t>
+              <w:t>Proceso, CCB y registro SC-01 a SC-20</w:t>
             </w:r>
           </w:p>
         </w:tc>
@@ -2845,7 +2845,7 @@
                 <w:sz w:val="14"/>
                 <w:szCs w:val="14"/>
               </w:rPr>
-              <w:t>Estado al 06-10-2026</w:t>
+              <w:t>Estado al 22-10-2026</w:t>
             </w:r>
           </w:p>
         </w:tc>
@@ -4253,7 +4253,7 @@
                 <w:sz w:val="18"/>
                 <w:szCs w:val="18"/>
               </w:rPr>
-              <w:t>13 riesgos, matriz P×I y riesgo regulatorio cuantificado</w:t>
+              <w:t>14 riesgos, matriz P×I y riesgo regulatorio cuantificado</w:t>
             </w:r>
           </w:p>
         </w:tc>
@@ -4365,7 +4365,7 @@
                 <w:sz w:val="18"/>
                 <w:szCs w:val="18"/>
               </w:rPr>
-              <w:t>40 casos de uso con diagramas por módulo</w:t>
+              <w:t>41 casos de uso con diagramas por módulo</w:t>
             </w:r>
           </w:p>
         </w:tc>
@@ -4377,7 +4377,6 @@
         <w:tc>
           <w:tcPr>
             <w:tcW w:w="3800" w:type="dxa"/>
-            <w:shd w:val="clear" w:color="auto" w:fill="F2F5FA"/>
             <w:tcMar>
               <w:top w:w="80" w:type="dxa"/>
               <w:left w:w="100" w:type="dxa"/>
@@ -4396,14 +4395,13 @@
                 <w:sz w:val="18"/>
                 <w:szCs w:val="18"/>
               </w:rPr>
-              <w:t>Anexo_A_Cumplimiento_Normativo_y_Gobierno_de_Datos.docx</w:t>
+              <w:t>18_Plan_y_Casos_de_Prueba.docx</w:t>
             </w:r>
           </w:p>
         </w:tc>
         <w:tc>
           <w:tcPr>
             <w:tcW w:w="5700" w:type="dxa"/>
-            <w:shd w:val="clear" w:color="auto" w:fill="F2F5FA"/>
             <w:tcMar>
               <w:top w:w="80" w:type="dxa"/>
               <w:left w:w="100" w:type="dxa"/>
@@ -4422,7 +4420,7 @@
                 <w:sz w:val="18"/>
                 <w:szCs w:val="18"/>
               </w:rPr>
-              <w:t>Marco legal, matriz de cumplimiento, brechas, RAT y gobierno DAMA-DMBOK</w:t>
+              <w:t>Plan de pruebas (ISO/IEC/IEEE 29119-3): 77 casos funcionales, 22 pruebas automatizadas de base de datos, 11 casos no funcionales y 6 escenarios de aceptación</w:t>
             </w:r>
           </w:p>
         </w:tc>
@@ -4434,6 +4432,7 @@
         <w:tc>
           <w:tcPr>
             <w:tcW w:w="3800" w:type="dxa"/>
+            <w:shd w:val="clear" w:color="auto" w:fill="F2F5FA"/>
             <w:tcMar>
               <w:top w:w="80" w:type="dxa"/>
               <w:left w:w="100" w:type="dxa"/>
@@ -4452,13 +4451,14 @@
                 <w:sz w:val="18"/>
                 <w:szCs w:val="18"/>
               </w:rPr>
-              <w:t>Politica_de_Privacidad_y_Terminos_y_Condiciones.docx</w:t>
+              <w:t>Anexo_A_Cumplimiento_Normativo_y_Gobierno_de_Datos.docx</w:t>
             </w:r>
           </w:p>
         </w:tc>
         <w:tc>
           <w:tcPr>
             <w:tcW w:w="5700" w:type="dxa"/>
+            <w:shd w:val="clear" w:color="auto" w:fill="F2F5FA"/>
             <w:tcMar>
               <w:top w:w="80" w:type="dxa"/>
               <w:left w:w="100" w:type="dxa"/>
@@ -4477,7 +4477,7 @@
                 <w:sz w:val="18"/>
                 <w:szCs w:val="18"/>
               </w:rPr>
-              <w:t>Textos listos para publicar (con campos por completar)</w:t>
+              <w:t>Marco legal, matriz de cumplimiento, brechas, RAT y gobierno DAMA-DMBOK</w:t>
             </w:r>
           </w:p>
         </w:tc>
@@ -4489,7 +4489,6 @@
         <w:tc>
           <w:tcPr>
             <w:tcW w:w="3800" w:type="dxa"/>
-            <w:shd w:val="clear" w:color="auto" w:fill="F2F5FA"/>
             <w:tcMar>
               <w:top w:w="80" w:type="dxa"/>
               <w:left w:w="100" w:type="dxa"/>
@@ -4508,14 +4507,13 @@
                 <w:sz w:val="18"/>
                 <w:szCs w:val="18"/>
               </w:rPr>
-              <w:t>KPIs_y_Costos_Barberia_Big-Boys.xlsx</w:t>
+              <w:t>Politica_de_Privacidad_y_Terminos_y_Condiciones.docx</w:t>
             </w:r>
           </w:p>
         </w:tc>
         <w:tc>
           <w:tcPr>
             <w:tcW w:w="5700" w:type="dxa"/>
-            <w:shd w:val="clear" w:color="auto" w:fill="F2F5FA"/>
             <w:tcMar>
               <w:top w:w="80" w:type="dxa"/>
               <w:left w:w="100" w:type="dxa"/>
@@ -4534,7 +4532,7 @@
                 <w:sz w:val="18"/>
                 <w:szCs w:val="18"/>
               </w:rPr>
-              <w:t>Modelo de KPIs, ROI y costos cloud con fórmulas y supuestos editables</w:t>
+              <w:t>Textos listos para publicar (con campos por completar)</w:t>
             </w:r>
           </w:p>
         </w:tc>
@@ -4546,6 +4544,7 @@
         <w:tc>
           <w:tcPr>
             <w:tcW w:w="3800" w:type="dxa"/>
+            <w:shd w:val="clear" w:color="auto" w:fill="F2F5FA"/>
             <w:tcMar>
               <w:top w:w="80" w:type="dxa"/>
               <w:left w:w="100" w:type="dxa"/>
@@ -4564,13 +4563,14 @@
                 <w:sz w:val="18"/>
                 <w:szCs w:val="18"/>
               </w:rPr>
-              <w:t>Diagramas/ (PNG, SVG y PlantUML)</w:t>
+              <w:t>KPIs_y_Costos_Barberia_Big-Boys.xlsx</w:t>
             </w:r>
           </w:p>
         </w:tc>
         <w:tc>
           <w:tcPr>
             <w:tcW w:w="5700" w:type="dxa"/>
+            <w:shd w:val="clear" w:color="auto" w:fill="F2F5FA"/>
             <w:tcMar>
               <w:top w:w="80" w:type="dxa"/>
               <w:left w:w="100" w:type="dxa"/>
@@ -4589,7 +4589,7 @@
                 <w:sz w:val="18"/>
                 <w:szCs w:val="18"/>
               </w:rPr>
-              <w:t>34 diagramas numerados con código fuente</w:t>
+              <w:t>Modelo de KPIs, ROI y costos cloud con fórmulas y supuestos editables</w:t>
             </w:r>
           </w:p>
         </w:tc>
@@ -4601,7 +4601,6 @@
         <w:tc>
           <w:tcPr>
             <w:tcW w:w="3800" w:type="dxa"/>
-            <w:shd w:val="clear" w:color="auto" w:fill="F2F5FA"/>
             <w:tcMar>
               <w:top w:w="80" w:type="dxa"/>
               <w:left w:w="100" w:type="dxa"/>
@@ -4620,14 +4619,13 @@
                 <w:sz w:val="18"/>
                 <w:szCs w:val="18"/>
               </w:rPr>
-              <w:t>Base_de_Datos/bigboys_ddl.sql</w:t>
+              <w:t>Diagramas/ (PNG, SVG y PlantUML)</w:t>
             </w:r>
           </w:p>
         </w:tc>
         <w:tc>
           <w:tcPr>
             <w:tcW w:w="5700" w:type="dxa"/>
-            <w:shd w:val="clear" w:color="auto" w:fill="F2F5FA"/>
             <w:tcMar>
               <w:top w:w="80" w:type="dxa"/>
               <w:left w:w="100" w:type="dxa"/>
@@ -4646,7 +4644,64 @@
                 <w:sz w:val="18"/>
                 <w:szCs w:val="18"/>
               </w:rPr>
-              <w:t>Script DDL PostgreSQL validado (14/14 pruebas)</w:t>
+              <w:t>35 diagramas numerados con código fuente</w:t>
+            </w:r>
+          </w:p>
+        </w:tc>
+      </w:tr>
+      <w:tr>
+        <w:trPr>
+          <w:cantSplit/>
+        </w:trPr>
+        <w:tc>
+          <w:tcPr>
+            <w:tcW w:w="3800" w:type="dxa"/>
+            <w:shd w:val="clear" w:color="auto" w:fill="F2F5FA"/>
+            <w:tcMar>
+              <w:top w:w="80" w:type="dxa"/>
+              <w:left w:w="100" w:type="dxa"/>
+              <w:bottom w:w="80" w:type="dxa"/>
+              <w:right w:w="100" w:type="dxa"/>
+            </w:tcMar>
+            <w:vAlign w:val="center"/>
+          </w:tcPr>
+          <w:p>
+            <w:pPr>
+              <w:spacing w:before="0" w:after="0" w:line="240" w:lineRule="auto"/>
+            </w:pPr>
+            <w:r>
+              <w:rPr>
+                <w:rFonts w:ascii="Arial" w:hAnsi="Arial" w:cs="Arial" w:eastAsia="Arial"/>
+                <w:sz w:val="18"/>
+                <w:szCs w:val="18"/>
+              </w:rPr>
+              <w:t>Base_de_Datos/bigboys_ddl.sql</w:t>
+            </w:r>
+          </w:p>
+        </w:tc>
+        <w:tc>
+          <w:tcPr>
+            <w:tcW w:w="5700" w:type="dxa"/>
+            <w:shd w:val="clear" w:color="auto" w:fill="F2F5FA"/>
+            <w:tcMar>
+              <w:top w:w="80" w:type="dxa"/>
+              <w:left w:w="100" w:type="dxa"/>
+              <w:bottom w:w="80" w:type="dxa"/>
+              <w:right w:w="100" w:type="dxa"/>
+            </w:tcMar>
+            <w:vAlign w:val="center"/>
+          </w:tcPr>
+          <w:p>
+            <w:pPr>
+              <w:spacing w:before="0" w:after="0" w:line="240" w:lineRule="auto"/>
+            </w:pPr>
+            <w:r>
+              <w:rPr>
+                <w:rFonts w:ascii="Arial" w:hAnsi="Arial" w:cs="Arial" w:eastAsia="Arial"/>
+                <w:sz w:val="18"/>
+                <w:szCs w:val="18"/>
+              </w:rPr>
+              <w:t>Script DDL PostgreSQL validado (22/22 pruebas en PGlite el 08-10-2026 y en Supabase el 20-10-2026)</w:t>
             </w:r>
           </w:p>
         </w:tc>
@@ -8561,7 +8616,7 @@
                 <w:sz w:val="13"/>
                 <w:szCs w:val="13"/>
               </w:rPr>
-              <w:t>Pantallas (wireframes)</w:t>
+              <w:t>Vista de procesos — secuencia</w:t>
             </w:r>
           </w:p>
         </w:tc>
@@ -11729,7 +11784,7 @@
           <w:sz w:val="22"/>
           <w:szCs w:val="22"/>
         </w:rPr>
-        <w:t>Revocar la clave de aplicación de Gmail expuesta en el código del prototipo y mover secretos a variables de entorno antes de subir el código al repositorio.</w:t>
+        <w:t>Revocar la clave de aplicación de Gmail expuesta en el código del prototipo y mover secretos a variables de entorno antes de subir el código al repositorio. Al 22-10-2026 la clave sigue escrita en el código de la web descargado el 21-10-2026 (mail_server.js, index.html y store.js).</w:t>
       </w:r>
     </w:p>
     <w:p>
@@ -11783,7 +11838,7 @@
           <w:sz w:val="22"/>
           <w:szCs w:val="22"/>
         </w:rPr>
-        <w:t>Aprobación formal del CCB de las solicitudes SC-02, SC-03, SC-05 y SC-06.</w:t>
+        <w:t>Aprobación formal del CCB de las solicitudes SC-02, SC-03, SC-05, SC-06, SC-19 y SC-20.</w:t>
       </w:r>
     </w:p>
     <w:p>
@@ -11801,7 +11856,7 @@
           <w:sz w:val="22"/>
           <w:szCs w:val="22"/>
         </w:rPr>
-        <w:t>Subir estos documentos a la carpeta de Drive del proyecto y al repositorio (no se hizo automáticamente).</w:t>
+        <w:t>Subir estos documentos a la carpeta de Drive del proyecto (el repositorio de GitHub ya los contiene).</w:t>
       </w:r>
     </w:p>
     <w:p>
@@ -11819,7 +11874,169 @@
           <w:sz w:val="22"/>
           <w:szCs w:val="22"/>
         </w:rPr>
-        <w:t>Retomar el código el 13-10-2026 con la migración a PostgreSQL (actividad crítica 1.4.3).</w:t>
+        <w:t>Migrar la web y la app desde las tablas del prototipo al modelo relacional de 26 tablas en Supabase y, luego, cerrar el acceso público a esas tablas (actividad crítica 1.4.3).</w:t>
+      </w:r>
+    </w:p>
+    <w:p>
+      <w:pPr>
+        <w:pStyle w:val="Heading1"/>
+        <w:keepNext/>
+        <w:spacing w:before="360" w:after="160"/>
+      </w:pPr>
+      <w:r>
+        <w:rPr>
+          <w:rFonts w:ascii="Arial" w:hAnsi="Arial" w:cs="Arial" w:eastAsia="Arial"/>
+          <w:b/>
+          <w:bCs/>
+          <w:color w:val="1F3864"/>
+          <w:sz w:val="28"/>
+          <w:szCs w:val="28"/>
+        </w:rPr>
+        <w:t>8. Actualización de coherencia del 22-10-2026</w:t>
+      </w:r>
+    </w:p>
+    <w:p>
+      <w:pPr>
+        <w:numPr>
+          <w:ilvl w:val="0"/>
+          <w:numId w:val="1"/>
+        </w:numPr>
+        <w:spacing w:before="0" w:after="60" w:line="264" w:lineRule="auto"/>
+        <w:ind w:left="540" w:hanging="270"/>
+      </w:pPr>
+      <w:r>
+        <w:rPr>
+          <w:rFonts w:ascii="Arial" w:hAnsi="Arial" w:cs="Arial" w:eastAsia="Arial"/>
+          <w:sz w:val="22"/>
+          <w:szCs w:val="22"/>
+        </w:rPr>
+        <w:t>Base de datos: implementada el 20-10-2026 en Supabase (PostgreSQL 17, región us-west-2, Oregón, EE. UU.) con las 26 tablas y 22/22 pruebas; la transferencia internacional quedó declarada (SC-18). Se reemplazaron las menciones a «PostgreSQL en un VPS en Santiago» en los documentos 08, 10 y 11, el DAS, el Acta de Constitución y el diagrama DIAG-13; el alojamiento de la API queda por definir (SC-20).</w:t>
+      </w:r>
+    </w:p>
+    <w:p>
+      <w:pPr>
+        <w:numPr>
+          <w:ilvl w:val="0"/>
+          <w:numId w:val="1"/>
+        </w:numPr>
+        <w:spacing w:before="0" w:after="60" w:line="264" w:lineRule="auto"/>
+        <w:ind w:left="540" w:hanging="270"/>
+      </w:pPr>
+      <w:r>
+        <w:rPr>
+          <w:rFonts w:ascii="Arial" w:hAnsi="Arial" w:cs="Arial" w:eastAsia="Arial"/>
+          <w:sz w:val="22"/>
+          <w:szCs w:val="22"/>
+        </w:rPr>
+        <w:t>Estado verificado del código (copia descargada el 21-10-2026): la web y la app ya se conectan directamente a Supabase, pero siguen usando las tablas del prototipo (users, appointments, locations, barbers, coupons, reviews y mail), no el modelo relacional de 26 tablas.</w:t>
+      </w:r>
+    </w:p>
+    <w:p>
+      <w:pPr>
+        <w:numPr>
+          <w:ilvl w:val="0"/>
+          <w:numId w:val="1"/>
+        </w:numPr>
+        <w:spacing w:before="0" w:after="60" w:line="264" w:lineRule="auto"/>
+        <w:ind w:left="540" w:hanging="270"/>
+      </w:pPr>
+      <w:r>
+        <w:rPr>
+          <w:rFonts w:ascii="Arial" w:hAnsi="Arial" w:cs="Arial" w:eastAsia="Arial"/>
+          <w:sz w:val="22"/>
+          <w:szCs w:val="22"/>
+        </w:rPr>
+        <w:t>Cifras unificadas en todos los documentos: 63 RF (58 de la V1 y 5 del roadmap V2), 11 RNF, 41 casos de uso, 35 diagramas, 26 tablas, 24 paquetes de la EDT, 14 riesgos y 22 pruebas de base de datos.</w:t>
+      </w:r>
+    </w:p>
+    <w:p>
+      <w:pPr>
+        <w:numPr>
+          <w:ilvl w:val="0"/>
+          <w:numId w:val="1"/>
+        </w:numPr>
+        <w:spacing w:before="0" w:after="60" w:line="264" w:lineRule="auto"/>
+        <w:ind w:left="540" w:hanging="270"/>
+      </w:pPr>
+      <w:r>
+        <w:rPr>
+          <w:rFonts w:ascii="Arial" w:hAnsi="Arial" w:cs="Arial" w:eastAsia="Arial"/>
+          <w:sz w:val="22"/>
+          <w:szCs w:val="22"/>
+        </w:rPr>
+        <w:t>Semana actual S11 (19-10 al 25-10-2026) en el Plan de Dirección, el Alcance, el Cronograma, la Carta Gantt (DIAG-31), el Informe de Avance y el ERS.</w:t>
+      </w:r>
+    </w:p>
+    <w:p>
+      <w:pPr>
+        <w:numPr>
+          <w:ilvl w:val="0"/>
+          <w:numId w:val="1"/>
+        </w:numPr>
+        <w:spacing w:before="0" w:after="60" w:line="264" w:lineRule="auto"/>
+        <w:ind w:left="540" w:hanging="270"/>
+      </w:pPr>
+      <w:r>
+        <w:rPr>
+          <w:rFonts w:ascii="Arial" w:hAnsi="Arial" w:cs="Arial" w:eastAsia="Arial"/>
+          <w:sz w:val="22"/>
+          <w:szCs w:val="22"/>
+        </w:rPr>
+        <w:t>Control de cambios: el registro quedó en orden numérico (SC-11 en su lugar) y se agregaron SC-19 (fase de despliegue) y SC-20 (alojamiento de la API y la web).</w:t>
+      </w:r>
+    </w:p>
+    <w:p>
+      <w:pPr>
+        <w:numPr>
+          <w:ilvl w:val="0"/>
+          <w:numId w:val="1"/>
+        </w:numPr>
+        <w:spacing w:before="0" w:after="60" w:line="264" w:lineRule="auto"/>
+        <w:ind w:left="540" w:hanging="270"/>
+      </w:pPr>
+      <w:r>
+        <w:rPr>
+          <w:rFonts w:ascii="Arial" w:hAnsi="Arial" w:cs="Arial" w:eastAsia="Arial"/>
+          <w:sz w:val="22"/>
+          <w:szCs w:val="22"/>
+        </w:rPr>
+        <w:t>Respaldos: el plan gratuito de Supabase no incluye respaldos y el plan Pro los conserva 7 días (Supabase, 2026). Para cumplir RNF-09 (30 días) se agrega un respaldo lógico diario propio (riesgo R-08).</w:t>
+      </w:r>
+    </w:p>
+    <w:p>
+      <w:pPr>
+        <w:numPr>
+          <w:ilvl w:val="0"/>
+          <w:numId w:val="1"/>
+        </w:numPr>
+        <w:spacing w:before="0" w:after="60" w:line="264" w:lineRule="auto"/>
+        <w:ind w:left="540" w:hanging="270"/>
+      </w:pPr>
+      <w:r>
+        <w:rPr>
+          <w:rFonts w:ascii="Arial" w:hAnsi="Arial" w:cs="Arial" w:eastAsia="Arial"/>
+          <w:sz w:val="22"/>
+          <w:szCs w:val="22"/>
+        </w:rPr>
+        <w:t>Nuevo riesgo R-14: las tablas del prototipo tienen acceso público (RLS permisivo) mientras la web y la app las usen; no se deben cargar datos reales hasta cerrarlas.</w:t>
+      </w:r>
+    </w:p>
+    <w:p>
+      <w:pPr>
+        <w:numPr>
+          <w:ilvl w:val="0"/>
+          <w:numId w:val="1"/>
+        </w:numPr>
+        <w:spacing w:before="0" w:after="60" w:line="264" w:lineRule="auto"/>
+        <w:ind w:left="540" w:hanging="270"/>
+      </w:pPr>
+      <w:r>
+        <w:rPr>
+          <w:rFonts w:ascii="Arial" w:hAnsi="Arial" w:cs="Arial" w:eastAsia="Arial"/>
+          <w:sz w:val="22"/>
+          <w:szCs w:val="22"/>
+        </w:rPr>
+        <w:t>Versiones: DAS 3.1, ERS revisión 04.1 y Acta de Constitución 2.1; los planes modificados pasan a la versión 1.1.</w:t>
       </w:r>
     </w:p>
     <w:p>
@@ -12703,6 +12920,20 @@
           <w:szCs w:val="22"/>
         </w:rPr>
         <w:t>. Recuperado el 6 de octubre de 2026, de https://www.sii.cl/valores_y_fechas/dolar/dolar2026.htm</w:t>
+      </w:r>
+    </w:p>
+    <w:p>
+      <w:pPr>
+        <w:spacing w:before="0" w:after="120" w:line="360" w:lineRule="auto"/>
+        <w:ind w:left="720" w:hanging="720"/>
+      </w:pPr>
+      <w:r>
+        <w:rPr>
+          <w:rFonts w:ascii="Arial" w:hAnsi="Arial" w:cs="Arial" w:eastAsia="Arial"/>
+          <w:sz w:val="22"/>
+          <w:szCs w:val="22"/>
+        </w:rPr>
+        <w:t>Supabase. (2026). Pricing. Recuperado el 22 de octubre de 2026, de https://supabase.com/pricing</w:t>
       </w:r>
     </w:p>
     <w:p>

</xml_diff>

<commit_message>
Actualiza docs 00, 12, 15 y README: clave de correo en archivos .env fuera del repositorio (R-03)
</commit_message>
<xml_diff>
--- a/Fase 2/Evidencias Proyecto/Evidencias de documentación/00_Inventario_y_Resumen_de_Cambios.docx
+++ b/Fase 2/Evidencias Proyecto/Evidencias de documentación/00_Inventario_y_Resumen_de_Cambios.docx
@@ -11784,7 +11784,7 @@
           <w:sz w:val="22"/>
           <w:szCs w:val="22"/>
         </w:rPr>
-        <w:t>Revocar la clave de aplicación de Gmail expuesta en el código del prototipo y mover secretos a variables de entorno antes de subir el código al repositorio. Al 22-10-2026 la clave sigue escrita en el código de la web descargado el 21-10-2026 (mail_server.js, index.html y store.js).</w:t>
+        <w:t>Mantener los secretos fuera del código y del repositorio. Desde el 22-10-2026 la clave de aplicación de Gmail ya no está escrita en el código: la web la lee desde un archivo .env (npm run mail) y la app desde BuildConfig (Secrets Gradle Plugin), ambos excluidos de git. Antes de producción, el envío de correos debe quedar solo en el servidor, para que la clave no viaje dentro de la app compilada (R-03).</w:t>
       </w:r>
     </w:p>
     <w:p>
@@ -11929,6 +11929,24 @@
           <w:szCs w:val="22"/>
         </w:rPr>
         <w:t>Estado verificado del código (copia descargada el 21-10-2026): la web y la app ya se conectan directamente a Supabase, pero siguen usando las tablas del prototipo (users, appointments, locations, barbers, coupons, reviews y mail), no el modelo relacional de 26 tablas.</w:t>
+      </w:r>
+    </w:p>
+    <w:p>
+      <w:pPr>
+        <w:numPr>
+          <w:ilvl w:val="0"/>
+          <w:numId w:val="1"/>
+        </w:numPr>
+        <w:spacing w:before="0" w:after="60" w:line="264" w:lineRule="auto"/>
+        <w:ind w:left="540" w:hanging="270"/>
+      </w:pPr>
+      <w:r>
+        <w:rPr>
+          <w:rFonts w:ascii="Arial" w:hAnsi="Arial" w:cs="Arial" w:eastAsia="Arial"/>
+          <w:sz w:val="22"/>
+          <w:szCs w:val="22"/>
+        </w:rPr>
+        <w:t>Secretos: la clave de aplicación de Gmail se retiró del código fuente (mail_server.js, index.html, store.js y DirectGmailSender.kt) y ahora se lee desde archivos .env locales excluidos del repositorio. Con esto, el código de la web y la app se subió a GitHub sin secretos el 22-10-2026 (R-03).</w:t>
       </w:r>
     </w:p>
     <w:p>

</xml_diff>

<commit_message>
Migra la web y la app al modelo relacional de 27 tablas y actualiza la documentación
- Supabase: tabla resena (SC-21), coordenadas de sucursales, barberos de prueba y
  13 funciones api_* como API REST (SC-20); tablas con RLS cerrado. Se eliminan las
  7 tablas del prototipo (cierra R-14).
- Web y app: usan solo las funciones api_*, el catálogo real de sucursales y servicios,
  y la app envía desde la cuenta de la barbería. Sin datos personales de integrantes.
- DDL de referencia v1.2 validado 24/24; pruebas de la API 17/17.
- Documentos 00, 03, 04, 06-12, 14-16, 18, actas y DAS 3.2; DIAG-13, DIAG-27 y DIAG-28.
</commit_message>
<xml_diff>
--- a/Fase 2/Evidencias Proyecto/Evidencias de documentación/00_Inventario_y_Resumen_de_Cambios.docx
+++ b/Fase 2/Evidencias Proyecto/Evidencias de documentación/00_Inventario_y_Resumen_de_Cambios.docx
@@ -2711,7 +2711,7 @@
                 <w:sz w:val="14"/>
                 <w:szCs w:val="14"/>
               </w:rPr>
-              <w:t>Proceso, CCB y registro SC-01 a SC-20</w:t>
+              <w:t>Proceso, CCB y registro SC-01 a SC-21</w:t>
             </w:r>
           </w:p>
         </w:tc>
@@ -4310,7 +4310,7 @@
                 <w:sz w:val="18"/>
                 <w:szCs w:val="18"/>
               </w:rPr>
-              <w:t>MER, modelo relacional (26 tablas), diccionario con clasificación/finalidad/plazo, DDL y validación</w:t>
+              <w:t>MER, modelo relacional (27 tablas), diccionario con clasificación/finalidad/plazo, DDL y validación</w:t>
             </w:r>
           </w:p>
         </w:tc>
@@ -4420,7 +4420,7 @@
                 <w:sz w:val="18"/>
                 <w:szCs w:val="18"/>
               </w:rPr>
-              <w:t>Plan de pruebas (ISO/IEC/IEEE 29119-3): 77 casos funcionales, 22 pruebas automatizadas de base de datos, 11 casos no funcionales y 6 escenarios de aceptación</w:t>
+              <w:t>Plan de pruebas (ISO/IEC/IEEE 29119-3): 77 casos funcionales, 24 pruebas automatizadas de base de datos, 11 casos no funcionales y 6 escenarios de aceptación</w:t>
             </w:r>
           </w:p>
         </w:tc>
@@ -4701,7 +4701,7 @@
                 <w:sz w:val="18"/>
                 <w:szCs w:val="18"/>
               </w:rPr>
-              <w:t>Script DDL PostgreSQL validado (22/22 pruebas en PGlite el 08-10-2026 y en Supabase el 20-10-2026)</w:t>
+              <w:t>Script DDL PostgreSQL validado (22/22 pruebas en PGlite el 08-10-2026 y en Supabase el 20-10-2026; 24/24 con la tabla resena el 22-10-2026)</w:t>
             </w:r>
           </w:p>
         </w:tc>
@@ -11838,7 +11838,7 @@
           <w:sz w:val="22"/>
           <w:szCs w:val="22"/>
         </w:rPr>
-        <w:t>Aprobación formal del CCB de las solicitudes SC-02, SC-03, SC-05, SC-06, SC-19 y SC-20.</w:t>
+        <w:t>Aprobación formal del CCB de las solicitudes SC-02, SC-03, SC-05, SC-06, SC-19, SC-20 y SC-21.</w:t>
       </w:r>
     </w:p>
     <w:p>
@@ -11874,7 +11874,7 @@
           <w:sz w:val="22"/>
           <w:szCs w:val="22"/>
         </w:rPr>
-        <w:t>Migrar la web y la app desde las tablas del prototipo al modelo relacional de 26 tablas en Supabase y, luego, cerrar el acceso público a esas tablas (actividad crítica 1.4.3).</w:t>
+        <w:t>Completar la actividad crítica 1.4.3: cuentas propias para el personal (barberos y cajeros), módulo «Mis datos» y pago del abono con la pasarela. Desde el 22-10-2026 la web y la app ya usan el modelo relacional.</w:t>
       </w:r>
     </w:p>
     <w:p>
@@ -11910,7 +11910,7 @@
           <w:sz w:val="22"/>
           <w:szCs w:val="22"/>
         </w:rPr>
-        <w:t>Base de datos: implementada el 20-10-2026 en Supabase (PostgreSQL 17, región us-west-2, Oregón, EE. UU.) con las 26 tablas y 22/22 pruebas; la transferencia internacional quedó declarada (SC-18). Se reemplazaron las menciones a «PostgreSQL en un VPS en Santiago» en los documentos 08, 10 y 11, el DAS, el Acta de Constitución y el diagrama DIAG-13; el alojamiento de la API queda por definir (SC-20).</w:t>
+        <w:t>Base de datos: implementada el 20-10-2026 en Supabase (PostgreSQL 17, región us-west-2, Oregón, EE. UU.) con las 26 tablas iniciales y 22/22 pruebas; la transferencia internacional quedó declarada (SC-18). Se reemplazaron las menciones a «PostgreSQL en un VPS en Santiago» en los documentos 08, 10 y 11, el DAS, el Acta de Constitución y el diagrama DIAG-13; el 22-10-2026 se decidió publicar la API en Supabase (SC-20).</w:t>
       </w:r>
     </w:p>
     <w:p>
@@ -11928,7 +11928,7 @@
           <w:sz w:val="22"/>
           <w:szCs w:val="22"/>
         </w:rPr>
-        <w:t>Estado verificado del código (copia descargada el 21-10-2026): la web y la app ya se conectan directamente a Supabase, pero siguen usando las tablas del prototipo (users, appointments, locations, barbers, coupons, reviews y mail), no el modelo relacional de 26 tablas.</w:t>
+        <w:t>Estado del código al 22-10-2026: la web y la app usan el modelo relacional a través de 13 funciones api_* que Supabase publica como API REST (SC-20). Las tablas siguen cerradas a la clave pública (RLS) y las 7 tablas del prototipo (users, appointments, locations, barbers, coupons, reviews y mail) se eliminaron. Se probaron la API (17/17), la web de punta a punta y la compilación de la app.</w:t>
       </w:r>
     </w:p>
     <w:p>
@@ -11964,7 +11964,7 @@
           <w:sz w:val="22"/>
           <w:szCs w:val="22"/>
         </w:rPr>
-        <w:t>Cifras unificadas en todos los documentos: 63 RF (58 de la V1 y 5 del roadmap V2), 11 RNF, 41 casos de uso, 35 diagramas, 26 tablas, 24 paquetes de la EDT, 14 riesgos y 22 pruebas de base de datos.</w:t>
+        <w:t>Cifras unificadas en todos los documentos: 63 RF (58 de la V1 y 5 del roadmap V2), 11 RNF, 41 casos de uso, 35 diagramas, 27 tablas, 24 paquetes de la EDT, 14 riesgos, 21 solicitudes de cambio y 24 pruebas de base de datos.</w:t>
       </w:r>
     </w:p>
     <w:p>
@@ -12000,7 +12000,7 @@
           <w:sz w:val="22"/>
           <w:szCs w:val="22"/>
         </w:rPr>
-        <w:t>Control de cambios: el registro quedó en orden numérico (SC-11 en su lugar) y se agregaron SC-19 (fase de despliegue) y SC-20 (alojamiento de la API y la web).</w:t>
+        <w:t>Control de cambios: el registro quedó en orden numérico (SC-11 en su lugar) y se agregaron SC-19 (fase de despliegue), SC-20 (API publicada en Supabase) y SC-21 (modelo de datos v1.2).</w:t>
       </w:r>
     </w:p>
     <w:p>
@@ -12036,7 +12036,25 @@
           <w:sz w:val="22"/>
           <w:szCs w:val="22"/>
         </w:rPr>
-        <w:t>Nuevo riesgo R-14: las tablas del prototipo tienen acceso público (RLS permisivo) mientras la web y la app las usen; no se deben cargar datos reales hasta cerrarlas.</w:t>
+        <w:t>Riesgo R-14 (acceso público a las tablas del prototipo): cerrado el 22-10-2026, al eliminar esas tablas.</w:t>
+      </w:r>
+    </w:p>
+    <w:p>
+      <w:pPr>
+        <w:numPr>
+          <w:ilvl w:val="0"/>
+          <w:numId w:val="1"/>
+        </w:numPr>
+        <w:spacing w:before="0" w:after="60" w:line="264" w:lineRule="auto"/>
+        <w:ind w:left="540" w:hanging="270"/>
+      </w:pPr>
+      <w:r>
+        <w:rPr>
+          <w:rFonts w:ascii="Arial" w:hAnsi="Arial" w:cs="Arial" w:eastAsia="Arial"/>
+          <w:sz w:val="22"/>
+          <w:szCs w:val="22"/>
+        </w:rPr>
+        <w:t>Modelo de datos v1.2 (SC-21): nueva tabla resena (calificación de barberos, RF-09), coordenadas de las sucursales y 4 barberos de prueba hasta recibir la nómina real; 27 tablas y 239 campos. El script se validó con 24/24 pruebas en PGlite (22-10-2026). Se actualizaron el documento 16, DIAG-27, DIAG-28 y DIAG-13.</w:t>
       </w:r>
     </w:p>
     <w:p>

</xml_diff>

<commit_message>
Agrega la presentación de avance v6 (23-10) y riesgos R-15 a R-17 en el plan de riesgos (v1.3)
</commit_message>
<xml_diff>
--- a/Fase 2/Evidencias Proyecto/Evidencias de documentación/00_Inventario_y_Resumen_de_Cambios.docx
+++ b/Fase 2/Evidencias Proyecto/Evidencias de documentación/00_Inventario_y_Resumen_de_Cambios.docx
@@ -4253,7 +4253,7 @@
                 <w:sz w:val="18"/>
                 <w:szCs w:val="18"/>
               </w:rPr>
-              <w:t>14 riesgos, matriz P×I y riesgo regulatorio cuantificado</w:t>
+              <w:t>17 riesgos, matriz P×I y riesgo regulatorio cuantificado</w:t>
             </w:r>
           </w:p>
         </w:tc>
@@ -11964,7 +11964,7 @@
           <w:sz w:val="22"/>
           <w:szCs w:val="22"/>
         </w:rPr>
-        <w:t>Cifras unificadas en todos los documentos: 63 RF (58 de la V1 y 5 del roadmap V2), 11 RNF, 41 casos de uso, 35 diagramas, 27 tablas, 24 paquetes de la EDT, 14 riesgos, 21 solicitudes de cambio y 24 pruebas de base de datos.</w:t>
+        <w:t>Cifras unificadas en todos los documentos: 63 RF (58 de la V1 y 5 del roadmap V2), 11 RNF, 41 casos de uso, 35 diagramas, 27 tablas, 24 paquetes de la EDT, 17 riesgos, 21 solicitudes de cambio y 24 pruebas de base de datos.</w:t>
       </w:r>
     </w:p>
     <w:p>

</xml_diff>

<commit_message>
Documentación al H6 (30-10): control de cambios v1.3 (SC-22 a SC-26), riesgos v1.4 con ID fijo y R-18, base de datos v1.3, plan de pruebas v1.2 (API 20/20, seguridad 16/16, web 13/13), inventario y estado de avance
</commit_message>
<xml_diff>
--- a/Fase 2/Evidencias Proyecto/Evidencias de documentación/00_Inventario_y_Resumen_de_Cambios.docx
+++ b/Fase 2/Evidencias Proyecto/Evidencias de documentación/00_Inventario_y_Resumen_de_Cambios.docx
@@ -2711,7 +2711,7 @@
                 <w:sz w:val="14"/>
                 <w:szCs w:val="14"/>
               </w:rPr>
-              <w:t>Proceso, CCB y registro SC-01 a SC-21</w:t>
+              <w:t>Proceso, CCB y registro SC-01 a SC-26</w:t>
             </w:r>
           </w:p>
         </w:tc>
@@ -4253,7 +4253,7 @@
                 <w:sz w:val="18"/>
                 <w:szCs w:val="18"/>
               </w:rPr>
-              <w:t>17 riesgos, matriz P×I y riesgo regulatorio cuantificado</w:t>
+              <w:t>18 riesgos, matriz P×I y riesgo regulatorio cuantificado</w:t>
             </w:r>
           </w:p>
         </w:tc>
@@ -12073,6 +12073,114 @@
           <w:szCs w:val="22"/>
         </w:rPr>
         <w:t>Versiones: DAS 3.1, ERS revisión 04.1 y Acta de Constitución 2.1; los planes modificados pasan a la versión 1.1.</w:t>
+      </w:r>
+    </w:p>
+    <w:p>
+      <w:pPr>
+        <w:pStyle w:val="Heading1"/>
+        <w:keepNext/>
+        <w:spacing w:before="360" w:after="160"/>
+      </w:pPr>
+      <w:r>
+        <w:rPr>
+          <w:rFonts w:ascii="Arial" w:hAnsi="Arial" w:cs="Arial" w:eastAsia="Arial"/>
+          <w:b/>
+          <w:bCs/>
+          <w:color w:val="1F3864"/>
+          <w:sz w:val="28"/>
+          <w:szCs w:val="28"/>
+        </w:rPr>
+        <w:t>9. Seguimiento del 30-10-2026 (S12, hito H6)</w:t>
+      </w:r>
+    </w:p>
+    <w:p>
+      <w:pPr>
+        <w:numPr>
+          <w:ilvl w:val="0"/>
+          <w:numId w:val="1"/>
+        </w:numPr>
+        <w:spacing w:before="0" w:after="60" w:line="264" w:lineRule="auto"/>
+        <w:ind w:left="540" w:hanging="270"/>
+      </w:pPr>
+      <w:r>
+        <w:rPr>
+          <w:rFonts w:ascii="Arial" w:hAnsi="Arial" w:cs="Arial" w:eastAsia="Arial"/>
+          <w:sz w:val="22"/>
+          <w:szCs w:val="22"/>
+        </w:rPr>
+        <w:t>Sistema integrado (H6): la web y la app integran el pago del abono con Webpay (ambiente de integración de Transbank), la fila por orden de llegada, «Mis datos» y las cuentas del personal (SC-22, SC-23). La API pasó de 13 a 32 funciones api_*.</w:t>
+      </w:r>
+    </w:p>
+    <w:p>
+      <w:pPr>
+        <w:numPr>
+          <w:ilvl w:val="0"/>
+          <w:numId w:val="1"/>
+        </w:numPr>
+        <w:spacing w:before="0" w:after="60" w:line="264" w:lineRule="auto"/>
+        <w:ind w:left="540" w:hanging="270"/>
+      </w:pPr>
+      <w:r>
+        <w:rPr>
+          <w:rFonts w:ascii="Arial" w:hAnsi="Arial" w:cs="Arial" w:eastAsia="Arial"/>
+          <w:sz w:val="22"/>
+          <w:szCs w:val="22"/>
+        </w:rPr>
+        <w:t>Seguridad de las reservas (28-10-2026, SC-24): cambios solo del titular, del Dueño o del cajero/a de la sucursal; sin reservas confirmadas sin pago; contacto oculto al barbero; bloqueo temporal de 15 minutos tras 5 intentos fallidos. Pruebas: API 20/20, seguridad 16/16 y web 13/13.</w:t>
+      </w:r>
+    </w:p>
+    <w:p>
+      <w:pPr>
+        <w:numPr>
+          <w:ilvl w:val="0"/>
+          <w:numId w:val="1"/>
+        </w:numPr>
+        <w:spacing w:before="0" w:after="60" w:line="264" w:lineRule="auto"/>
+        <w:ind w:left="540" w:hanging="270"/>
+      </w:pPr>
+      <w:r>
+        <w:rPr>
+          <w:rFonts w:ascii="Arial" w:hAnsi="Arial" w:cs="Arial" w:eastAsia="Arial"/>
+          <w:sz w:val="22"/>
+          <w:szCs w:val="22"/>
+        </w:rPr>
+        <w:t>Ambiente UAT de la web en GitHub Pages (SC-25). Riesgos con ID fijo en las presentaciones (SC-26) y nuevo R-18; el Plan de Gestión de los Riesgos pasa a la versión 1.4.</w:t>
+      </w:r>
+    </w:p>
+    <w:p>
+      <w:pPr>
+        <w:numPr>
+          <w:ilvl w:val="0"/>
+          <w:numId w:val="1"/>
+        </w:numPr>
+        <w:spacing w:before="0" w:after="60" w:line="264" w:lineRule="auto"/>
+        <w:ind w:left="540" w:hanging="270"/>
+      </w:pPr>
+      <w:r>
+        <w:rPr>
+          <w:rFonts w:ascii="Arial" w:hAnsi="Arial" w:cs="Arial" w:eastAsia="Arial"/>
+          <w:sz w:val="22"/>
+          <w:szCs w:val="22"/>
+        </w:rPr>
+        <w:t>Cifras al 30-10-2026: 27 tablas, 32 funciones de la API, 18 riesgos (17 activos) y 26 solicitudes de cambio. Versiones: documento 11 v1.3, 15 v1.4, 16 v1.3 y 18 v1.2.</w:t>
+      </w:r>
+    </w:p>
+    <w:p>
+      <w:pPr>
+        <w:numPr>
+          <w:ilvl w:val="0"/>
+          <w:numId w:val="1"/>
+        </w:numPr>
+        <w:spacing w:before="0" w:after="60" w:line="264" w:lineRule="auto"/>
+        <w:ind w:left="540" w:hanging="270"/>
+      </w:pPr>
+      <w:r>
+        <w:rPr>
+          <w:rFonts w:ascii="Arial" w:hAnsi="Arial" w:cs="Arial" w:eastAsia="Arial"/>
+          <w:sz w:val="22"/>
+          <w:szCs w:val="22"/>
+        </w:rPr>
+        <w:t>Pendientes para S13: notificaciones por correo (R-17), respaldo diario propio (R-08), prueba de la app en un teléfono real (R-16), APK firmada y limpieza de los datos de prueba antes del paso al ambiente UAT (R-18).</w:t>
       </w:r>
     </w:p>
     <w:p>

</xml_diff>